<commit_message>
Add Venezuela reconstruction connection to illustrative connections
Replaces the optional note with a full connection linking the Venezuelan-
American Chamber of Commerce, Fedecámaras and CEDICE with U.S. business.

Co-Authored-By: Claude Opus 5.5 <noreply@anthropic.com>
Claude-Session: https://claude.ai/code/session_01CvseaSPRyEaZ9dk2EN4SFT
</commit_message>
<xml_diff>
--- a/Illustrative_Connections_CIPE_US_Business.docx
+++ b/Illustrative_Connections_CIPE_US_Business.docx
@@ -298,6 +298,34 @@
     </w:p>
     <w:p>
       <w:pPr>
+        <w:pStyle w:val="ListParagraph"/>
+        <w:numPr>
+          <w:ilvl w:val="0"/>
+          <w:numId w:val="2"/>
+        </w:numPr>
+        <w:spacing w:after="60"/>
+      </w:pPr>
+      <w:r>
+        <w:rPr>
+          <w:rFonts w:ascii="Calibri" w:cs="Calibri" w:eastAsia="Calibri" w:hAnsi="Calibri"/>
+          <w:b/>
+          <w:bCs/>
+          <w:sz w:val="21"/>
+          <w:szCs w:val="21"/>
+        </w:rPr>
+        <w:t xml:space="preserve">I. Diaspora and reconstruction: rules for a market recovery</w:t>
+      </w:r>
+      <w:r>
+        <w:rPr>
+          <w:rFonts w:ascii="Calibri" w:cs="Calibri" w:eastAsia="Calibri" w:hAnsi="Calibri"/>
+          <w:sz w:val="21"/>
+          <w:szCs w:val="21"/>
+        </w:rPr>
+        <w:t xml:space="preserve"> — Venezuela and Miami: diaspora capital and U.S. investment for a democratic, market-based recovery</w:t>
+      </w:r>
+    </w:p>
+    <w:p>
+      <w:pPr>
         <w:pStyle w:val="Heading2"/>
         <w:spacing w:after="80" w:before="160"/>
       </w:pPr>
@@ -5895,107 +5923,869 @@
         <w:br w:type="page"/>
       </w:r>
     </w:p>
+    <w:tbl>
+      <w:tblPr>
+        <w:tblW w:type="dxa" w:w="9360"/>
+        <w:tblBorders>
+          <w:top w:val="single" w:color="auto" w:sz="4"/>
+          <w:left w:val="single" w:color="auto" w:sz="4"/>
+          <w:bottom w:val="single" w:color="auto" w:sz="4"/>
+          <w:right w:val="single" w:color="auto" w:sz="4"/>
+          <w:insideH w:val="single" w:color="auto" w:sz="4"/>
+          <w:insideV w:val="single" w:color="auto" w:sz="4"/>
+        </w:tblBorders>
+      </w:tblPr>
+      <w:tblGrid>
+        <w:gridCol w:w="9360"/>
+      </w:tblGrid>
+      <w:tr>
+        <w:tc>
+          <w:tcPr>
+            <w:tcW w:type="dxa" w:w="9360"/>
+            <w:tcBorders>
+              <w:top w:val="single" w:color="BFBFBF" w:sz="4"/>
+              <w:left w:val="single" w:color="BFBFBF" w:sz="4"/>
+              <w:bottom w:val="single" w:color="BFBFBF" w:sz="4"/>
+              <w:right w:val="single" w:color="BFBFBF" w:sz="4"/>
+            </w:tcBorders>
+            <w:shd w:fill="1F3864" w:color="auto" w:val="clear"/>
+            <w:tcMar>
+              <w:top w:type="dxa" w:w="100"/>
+              <w:left w:type="dxa" w:w="140"/>
+              <w:bottom w:type="dxa" w:w="100"/>
+              <w:right w:type="dxa" w:w="140"/>
+            </w:tcMar>
+          </w:tcPr>
+          <w:p>
+            <w:r>
+              <w:rPr>
+                <w:rFonts w:ascii="Calibri" w:cs="Calibri" w:eastAsia="Calibri" w:hAnsi="Calibri"/>
+                <w:b/>
+                <w:bCs/>
+                <w:color w:val="FFFFFF"/>
+                <w:spacing w:val="20"/>
+                <w:sz w:val="22"/>
+                <w:szCs w:val="22"/>
+              </w:rPr>
+              <w:t xml:space="preserve">ILLUSTRATIVE CONNECTION I  •  DIASPORA AND RECONSTRUCTION: RULES FOR A MARKET RECOVERY</w:t>
+            </w:r>
+          </w:p>
+        </w:tc>
+      </w:tr>
+      <w:tr>
+        <w:tc>
+          <w:tcPr>
+            <w:tcW w:type="dxa" w:w="9360"/>
+            <w:tcBorders>
+              <w:top w:val="single" w:color="BFBFBF" w:sz="4"/>
+              <w:left w:val="single" w:color="BFBFBF" w:sz="4"/>
+              <w:bottom w:val="single" w:color="BFBFBF" w:sz="4"/>
+              <w:right w:val="single" w:color="BFBFBF" w:sz="4"/>
+            </w:tcBorders>
+            <w:shd w:fill="F2F2F2" w:color="auto" w:val="clear"/>
+            <w:tcMar>
+              <w:top w:type="dxa" w:w="100"/>
+              <w:left w:type="dxa" w:w="140"/>
+              <w:bottom w:type="dxa" w:w="100"/>
+              <w:right w:type="dxa" w:w="140"/>
+            </w:tcMar>
+          </w:tcPr>
+          <w:p>
+            <w:r>
+              <w:rPr>
+                <w:rFonts w:ascii="Calibri" w:cs="Calibri" w:eastAsia="Calibri" w:hAnsi="Calibri"/>
+                <w:b/>
+                <w:bCs/>
+                <w:color w:val="1F3864"/>
+                <w:sz w:val="22"/>
+                <w:szCs w:val="22"/>
+              </w:rPr>
+              <w:t xml:space="preserve">Venezuela and Miami: diaspora capital and U.S. investment for a democratic, market-based recovery</w:t>
+            </w:r>
+          </w:p>
+        </w:tc>
+      </w:tr>
+    </w:tbl>
     <w:p>
       <w:pPr>
-        <w:pStyle w:val="Heading2"/>
-        <w:spacing w:after="80"/>
+        <w:spacing w:after="0"/>
       </w:pPr>
-      <w:r>
-        <w:rPr>
-          <w:rFonts w:ascii="Calibri" w:cs="Calibri" w:eastAsia="Calibri" w:hAnsi="Calibri"/>
-        </w:rPr>
-        <w:t xml:space="preserve">Optional addition: Venezuela reconstruction</w:t>
-      </w:r>
     </w:p>
+    <w:tbl>
+      <w:tblPr>
+        <w:tblW w:type="dxa" w:w="9360"/>
+        <w:tblBorders>
+          <w:top w:val="single" w:color="auto" w:sz="4"/>
+          <w:left w:val="single" w:color="auto" w:sz="4"/>
+          <w:bottom w:val="single" w:color="auto" w:sz="4"/>
+          <w:right w:val="single" w:color="auto" w:sz="4"/>
+          <w:insideH w:val="single" w:color="auto" w:sz="4"/>
+          <w:insideV w:val="single" w:color="auto" w:sz="4"/>
+        </w:tblBorders>
+      </w:tblPr>
+      <w:tblGrid>
+        <w:gridCol w:w="2300"/>
+        <w:gridCol w:w="7060"/>
+      </w:tblGrid>
+      <w:tr>
+        <w:trPr>
+          <w:cantSplit/>
+        </w:trPr>
+        <w:tc>
+          <w:tcPr>
+            <w:tcW w:type="dxa" w:w="2300"/>
+            <w:tcBorders>
+              <w:top w:val="single" w:color="BFBFBF" w:sz="4"/>
+              <w:left w:val="single" w:color="BFBFBF" w:sz="4"/>
+              <w:bottom w:val="single" w:color="BFBFBF" w:sz="4"/>
+              <w:right w:val="single" w:color="BFBFBF" w:sz="4"/>
+            </w:tcBorders>
+            <w:shd w:fill="DEEAF6" w:color="auto" w:val="clear"/>
+            <w:tcMar>
+              <w:top w:type="dxa" w:w="80"/>
+              <w:left w:type="dxa" w:w="120"/>
+              <w:bottom w:type="dxa" w:w="80"/>
+              <w:right w:type="dxa" w:w="120"/>
+            </w:tcMar>
+          </w:tcPr>
+          <w:p>
+            <w:r>
+              <w:rPr>
+                <w:rFonts w:ascii="Calibri" w:cs="Calibri" w:eastAsia="Calibri" w:hAnsi="Calibri"/>
+                <w:b/>
+                <w:bCs/>
+                <w:color w:val="1F3864"/>
+                <w:sz w:val="19"/>
+                <w:szCs w:val="19"/>
+              </w:rPr>
+              <w:t xml:space="preserve">CIPE partner</w:t>
+            </w:r>
+          </w:p>
+        </w:tc>
+        <w:tc>
+          <w:tcPr>
+            <w:tcW w:type="dxa" w:w="7060"/>
+            <w:tcBorders>
+              <w:top w:val="single" w:color="BFBFBF" w:sz="4"/>
+              <w:left w:val="single" w:color="BFBFBF" w:sz="4"/>
+              <w:bottom w:val="single" w:color="BFBFBF" w:sz="4"/>
+              <w:right w:val="single" w:color="BFBFBF" w:sz="4"/>
+            </w:tcBorders>
+            <w:tcMar>
+              <w:top w:type="dxa" w:w="80"/>
+              <w:left w:type="dxa" w:w="120"/>
+              <w:bottom w:type="dxa" w:w="80"/>
+              <w:right w:type="dxa" w:w="120"/>
+            </w:tcMar>
+          </w:tcPr>
+          <w:p>
+            <w:pPr>
+              <w:spacing w:after="60"/>
+            </w:pPr>
+            <w:r>
+              <w:rPr>
+                <w:rFonts w:ascii="Calibri" w:cs="Calibri" w:eastAsia="Calibri" w:hAnsi="Calibri"/>
+                <w:b/>
+                <w:bCs/>
+                <w:sz w:val="19"/>
+                <w:szCs w:val="19"/>
+              </w:rPr>
+              <w:t xml:space="preserve">CEDICE Libertad</w:t>
+            </w:r>
+            <w:r>
+              <w:rPr>
+                <w:rFonts w:ascii="Calibri" w:cs="Calibri" w:eastAsia="Calibri" w:hAnsi="Calibri"/>
+                <w:sz w:val="19"/>
+                <w:szCs w:val="19"/>
+              </w:rPr>
+              <w:t xml:space="preserve"> (Caracas think tank on free markets and rule of law) </w:t>
+            </w:r>
+            <w:r>
+              <w:rPr>
+                <w:rFonts w:ascii="Calibri" w:cs="Calibri" w:eastAsia="Calibri" w:hAnsi="Calibri"/>
+                <w:sz w:val="19"/>
+                <w:szCs w:val="19"/>
+                <w:highlight w:val="yellow"/>
+                <w:highlightCs w:val="yellow"/>
+              </w:rPr>
+              <w:t xml:space="preserve">[confirm with CIPE]</w:t>
+            </w:r>
+            <w:r>
+              <w:rPr>
+                <w:rFonts w:ascii="Calibri" w:cs="Calibri" w:eastAsia="Calibri" w:hAnsi="Calibri"/>
+                <w:sz w:val="19"/>
+                <w:szCs w:val="19"/>
+              </w:rPr>
+              <w:t xml:space="preserve">. Industry partners: </w:t>
+            </w:r>
+            <w:r>
+              <w:rPr>
+                <w:rFonts w:ascii="Calibri" w:cs="Calibri" w:eastAsia="Calibri" w:hAnsi="Calibri"/>
+                <w:b/>
+                <w:bCs/>
+                <w:sz w:val="19"/>
+                <w:szCs w:val="19"/>
+              </w:rPr>
+              <w:t xml:space="preserve">Fedecámaras</w:t>
+            </w:r>
+            <w:r>
+              <w:rPr>
+                <w:rFonts w:ascii="Calibri" w:cs="Calibri" w:eastAsia="Calibri" w:hAnsi="Calibri"/>
+                <w:sz w:val="19"/>
+                <w:szCs w:val="19"/>
+              </w:rPr>
+              <w:t xml:space="preserve">, which plans an alliance with Venezuelan entrepreneurs abroad, and </w:t>
+            </w:r>
+            <w:r>
+              <w:rPr>
+                <w:rFonts w:ascii="Calibri" w:cs="Calibri" w:eastAsia="Calibri" w:hAnsi="Calibri"/>
+                <w:b/>
+                <w:bCs/>
+                <w:sz w:val="19"/>
+                <w:szCs w:val="19"/>
+              </w:rPr>
+              <w:t xml:space="preserve">Conindustria</w:t>
+            </w:r>
+            <w:r>
+              <w:rPr>
+                <w:rFonts w:ascii="Calibri" w:cs="Calibri" w:eastAsia="Calibri" w:hAnsi="Calibri"/>
+                <w:sz w:val="19"/>
+                <w:szCs w:val="19"/>
+              </w:rPr>
+              <w:t xml:space="preserve"> (manufacturers). Diaspora bridge: the </w:t>
+            </w:r>
+            <w:r>
+              <w:rPr>
+                <w:rFonts w:ascii="Calibri" w:cs="Calibri" w:eastAsia="Calibri" w:hAnsi="Calibri"/>
+                <w:b/>
+                <w:bCs/>
+                <w:sz w:val="19"/>
+                <w:szCs w:val="19"/>
+              </w:rPr>
+              <w:t xml:space="preserve">Venezuelan-American Chamber of Commerce of the United States (VACC)</w:t>
+            </w:r>
+            <w:r>
+              <w:rPr>
+                <w:rFonts w:ascii="Calibri" w:cs="Calibri" w:eastAsia="Calibri" w:hAnsi="Calibri"/>
+                <w:sz w:val="19"/>
+                <w:szCs w:val="19"/>
+              </w:rPr>
+              <w:t xml:space="preserve">, Miami.</w:t>
+            </w:r>
+          </w:p>
+        </w:tc>
+      </w:tr>
+      <w:tr>
+        <w:trPr>
+          <w:cantSplit/>
+        </w:trPr>
+        <w:tc>
+          <w:tcPr>
+            <w:tcW w:type="dxa" w:w="2300"/>
+            <w:tcBorders>
+              <w:top w:val="single" w:color="BFBFBF" w:sz="4"/>
+              <w:left w:val="single" w:color="BFBFBF" w:sz="4"/>
+              <w:bottom w:val="single" w:color="BFBFBF" w:sz="4"/>
+              <w:right w:val="single" w:color="BFBFBF" w:sz="4"/>
+            </w:tcBorders>
+            <w:shd w:fill="DEEAF6" w:color="auto" w:val="clear"/>
+            <w:tcMar>
+              <w:top w:type="dxa" w:w="80"/>
+              <w:left w:type="dxa" w:w="120"/>
+              <w:bottom w:type="dxa" w:w="80"/>
+              <w:right w:type="dxa" w:w="120"/>
+            </w:tcMar>
+          </w:tcPr>
+          <w:p>
+            <w:r>
+              <w:rPr>
+                <w:rFonts w:ascii="Calibri" w:cs="Calibri" w:eastAsia="Calibri" w:hAnsi="Calibri"/>
+                <w:b/>
+                <w:bCs/>
+                <w:color w:val="1F3864"/>
+                <w:sz w:val="19"/>
+                <w:szCs w:val="19"/>
+              </w:rPr>
+              <w:t xml:space="preserve">U.S. counterpart</w:t>
+            </w:r>
+          </w:p>
+        </w:tc>
+        <w:tc>
+          <w:tcPr>
+            <w:tcW w:type="dxa" w:w="7060"/>
+            <w:tcBorders>
+              <w:top w:val="single" w:color="BFBFBF" w:sz="4"/>
+              <w:left w:val="single" w:color="BFBFBF" w:sz="4"/>
+              <w:bottom w:val="single" w:color="BFBFBF" w:sz="4"/>
+              <w:right w:val="single" w:color="BFBFBF" w:sz="4"/>
+            </w:tcBorders>
+            <w:tcMar>
+              <w:top w:type="dxa" w:w="80"/>
+              <w:left w:type="dxa" w:w="120"/>
+              <w:bottom w:type="dxa" w:w="80"/>
+              <w:right w:type="dxa" w:w="120"/>
+            </w:tcMar>
+          </w:tcPr>
+          <w:p>
+            <w:pPr>
+              <w:spacing w:after="60"/>
+            </w:pPr>
+            <w:r>
+              <w:rPr>
+                <w:rFonts w:ascii="Calibri" w:cs="Calibri" w:eastAsia="Calibri" w:hAnsi="Calibri"/>
+                <w:b/>
+                <w:bCs/>
+                <w:sz w:val="19"/>
+                <w:szCs w:val="19"/>
+              </w:rPr>
+              <w:t xml:space="preserve">VACC</w:t>
+            </w:r>
+            <w:r>
+              <w:rPr>
+                <w:rFonts w:ascii="Calibri" w:cs="Calibri" w:eastAsia="Calibri" w:hAnsi="Calibri"/>
+                <w:sz w:val="19"/>
+                <w:szCs w:val="19"/>
+              </w:rPr>
+              <w:t xml:space="preserve"> member companies in Florida; </w:t>
+            </w:r>
+            <w:r>
+              <w:rPr>
+                <w:rFonts w:ascii="Calibri" w:cs="Calibri" w:eastAsia="Calibri" w:hAnsi="Calibri"/>
+                <w:b/>
+                <w:bCs/>
+                <w:sz w:val="19"/>
+                <w:szCs w:val="19"/>
+              </w:rPr>
+              <w:t xml:space="preserve">U.S. Chamber of Commerce</w:t>
+            </w:r>
+            <w:r>
+              <w:rPr>
+                <w:rFonts w:ascii="Calibri" w:cs="Calibri" w:eastAsia="Calibri" w:hAnsi="Calibri"/>
+                <w:sz w:val="19"/>
+                <w:szCs w:val="19"/>
+              </w:rPr>
+              <w:t xml:space="preserve"> (Americas); U.S. energy and logistics firms, such as </w:t>
+            </w:r>
+            <w:r>
+              <w:rPr>
+                <w:rFonts w:ascii="Calibri" w:cs="Calibri" w:eastAsia="Calibri" w:hAnsi="Calibri"/>
+                <w:b/>
+                <w:bCs/>
+                <w:sz w:val="19"/>
+                <w:szCs w:val="19"/>
+              </w:rPr>
+              <w:t xml:space="preserve">Chevron</w:t>
+            </w:r>
+            <w:r>
+              <w:rPr>
+                <w:rFonts w:ascii="Calibri" w:cs="Calibri" w:eastAsia="Calibri" w:hAnsi="Calibri"/>
+                <w:sz w:val="19"/>
+                <w:szCs w:val="19"/>
+              </w:rPr>
+              <w:t xml:space="preserve">, reported to plan about $7B over five years in Venezuela, and </w:t>
+            </w:r>
+            <w:r>
+              <w:rPr>
+                <w:rFonts w:ascii="Calibri" w:cs="Calibri" w:eastAsia="Calibri" w:hAnsi="Calibri"/>
+                <w:b/>
+                <w:bCs/>
+                <w:sz w:val="19"/>
+                <w:szCs w:val="19"/>
+              </w:rPr>
+              <w:t xml:space="preserve">PortMiami</w:t>
+            </w:r>
+            <w:r>
+              <w:rPr>
+                <w:rFonts w:ascii="Calibri" w:cs="Calibri" w:eastAsia="Calibri" w:hAnsi="Calibri"/>
+                <w:sz w:val="19"/>
+                <w:szCs w:val="19"/>
+              </w:rPr>
+              <w:t xml:space="preserve">, a VACC partner </w:t>
+            </w:r>
+            <w:r>
+              <w:rPr>
+                <w:rFonts w:ascii="Calibri" w:cs="Calibri" w:eastAsia="Calibri" w:hAnsi="Calibri"/>
+                <w:sz w:val="19"/>
+                <w:szCs w:val="19"/>
+                <w:highlight w:val="yellow"/>
+                <w:highlightCs w:val="yellow"/>
+              </w:rPr>
+              <w:t xml:space="preserve">[confirm interest]</w:t>
+            </w:r>
+            <w:r>
+              <w:rPr>
+                <w:rFonts w:ascii="Calibri" w:cs="Calibri" w:eastAsia="Calibri" w:hAnsi="Calibri"/>
+                <w:sz w:val="19"/>
+                <w:szCs w:val="19"/>
+              </w:rPr>
+              <w:t xml:space="preserve">; Venezuelan-American Chamber of Commerce and Industry (</w:t>
+            </w:r>
+            <w:r>
+              <w:rPr>
+                <w:rFonts w:ascii="Calibri" w:cs="Calibri" w:eastAsia="Calibri" w:hAnsi="Calibri"/>
+                <w:b/>
+                <w:bCs/>
+                <w:sz w:val="19"/>
+                <w:szCs w:val="19"/>
+              </w:rPr>
+              <w:t xml:space="preserve">VenAmCham</w:t>
+            </w:r>
+            <w:r>
+              <w:rPr>
+                <w:rFonts w:ascii="Calibri" w:cs="Calibri" w:eastAsia="Calibri" w:hAnsi="Calibri"/>
+                <w:sz w:val="19"/>
+                <w:szCs w:val="19"/>
+              </w:rPr>
+              <w:t xml:space="preserve">, Caracas) </w:t>
+            </w:r>
+            <w:r>
+              <w:rPr>
+                <w:rFonts w:ascii="Calibri" w:cs="Calibri" w:eastAsia="Calibri" w:hAnsi="Calibri"/>
+                <w:sz w:val="19"/>
+                <w:szCs w:val="19"/>
+                <w:highlight w:val="yellow"/>
+                <w:highlightCs w:val="yellow"/>
+              </w:rPr>
+              <w:t xml:space="preserve">[confirm]</w:t>
+            </w:r>
+          </w:p>
+        </w:tc>
+      </w:tr>
+      <w:tr>
+        <w:trPr>
+          <w:cantSplit/>
+        </w:trPr>
+        <w:tc>
+          <w:tcPr>
+            <w:tcW w:type="dxa" w:w="2300"/>
+            <w:tcBorders>
+              <w:top w:val="single" w:color="BFBFBF" w:sz="4"/>
+              <w:left w:val="single" w:color="BFBFBF" w:sz="4"/>
+              <w:bottom w:val="single" w:color="BFBFBF" w:sz="4"/>
+              <w:right w:val="single" w:color="BFBFBF" w:sz="4"/>
+            </w:tcBorders>
+            <w:shd w:fill="DEEAF6" w:color="auto" w:val="clear"/>
+            <w:tcMar>
+              <w:top w:type="dxa" w:w="80"/>
+              <w:left w:type="dxa" w:w="120"/>
+              <w:bottom w:type="dxa" w:w="80"/>
+              <w:right w:type="dxa" w:w="120"/>
+            </w:tcMar>
+          </w:tcPr>
+          <w:p>
+            <w:r>
+              <w:rPr>
+                <w:rFonts w:ascii="Calibri" w:cs="Calibri" w:eastAsia="Calibri" w:hAnsi="Calibri"/>
+                <w:b/>
+                <w:bCs/>
+                <w:color w:val="1F3864"/>
+                <w:sz w:val="19"/>
+                <w:szCs w:val="19"/>
+              </w:rPr>
+              <w:t xml:space="preserve">Shared interest</w:t>
+            </w:r>
+          </w:p>
+        </w:tc>
+        <w:tc>
+          <w:tcPr>
+            <w:tcW w:type="dxa" w:w="7060"/>
+            <w:tcBorders>
+              <w:top w:val="single" w:color="BFBFBF" w:sz="4"/>
+              <w:left w:val="single" w:color="BFBFBF" w:sz="4"/>
+              <w:bottom w:val="single" w:color="BFBFBF" w:sz="4"/>
+              <w:right w:val="single" w:color="BFBFBF" w:sz="4"/>
+            </w:tcBorders>
+            <w:tcMar>
+              <w:top w:type="dxa" w:w="80"/>
+              <w:left w:type="dxa" w:w="120"/>
+              <w:bottom w:type="dxa" w:w="80"/>
+              <w:right w:type="dxa" w:w="120"/>
+            </w:tcMar>
+          </w:tcPr>
+          <w:p>
+            <w:pPr>
+              <w:spacing w:after="60"/>
+            </w:pPr>
+            <w:r>
+              <w:rPr>
+                <w:rFonts w:ascii="Calibri" w:cs="Calibri" w:eastAsia="Calibri" w:hAnsi="Calibri"/>
+                <w:sz w:val="19"/>
+                <w:szCs w:val="19"/>
+              </w:rPr>
+              <w:t xml:space="preserve">A recovery built on clear rules rather than discretion:</w:t>
+            </w:r>
+          </w:p>
+          <w:p>
+            <w:pPr>
+              <w:pStyle w:val="ListParagraph"/>
+              <w:numPr>
+                <w:ilvl w:val="0"/>
+                <w:numId w:val="2"/>
+              </w:numPr>
+              <w:spacing w:after="40"/>
+            </w:pPr>
+            <w:r>
+              <w:rPr>
+                <w:rFonts w:ascii="Calibri" w:cs="Calibri" w:eastAsia="Calibri" w:hAnsi="Calibri"/>
+                <w:sz w:val="19"/>
+                <w:szCs w:val="19"/>
+              </w:rPr>
+              <w:t xml:space="preserve">Fedecámaras' "Carta de Valencia" calls for legal changes to protect private business and attract investment</w:t>
+            </w:r>
+          </w:p>
+          <w:p>
+            <w:pPr>
+              <w:pStyle w:val="ListParagraph"/>
+              <w:numPr>
+                <w:ilvl w:val="0"/>
+                <w:numId w:val="2"/>
+              </w:numPr>
+              <w:spacing w:after="40"/>
+            </w:pPr>
+            <w:r>
+              <w:rPr>
+                <w:rFonts w:ascii="Calibri" w:cs="Calibri" w:eastAsia="Calibri" w:hAnsi="Calibri"/>
+                <w:sz w:val="19"/>
+                <w:szCs w:val="19"/>
+              </w:rPr>
+              <w:t xml:space="preserve">The interim government has set up a commission to classify state assets for partnerships or sale; how open that process is will shape investor trust</w:t>
+            </w:r>
+          </w:p>
+          <w:p>
+            <w:pPr>
+              <w:pStyle w:val="ListParagraph"/>
+              <w:numPr>
+                <w:ilvl w:val="0"/>
+                <w:numId w:val="2"/>
+              </w:numPr>
+              <w:spacing w:after="40"/>
+            </w:pPr>
+            <w:r>
+              <w:rPr>
+                <w:rFonts w:ascii="Calibri" w:cs="Calibri" w:eastAsia="Calibri" w:hAnsi="Calibri"/>
+                <w:sz w:val="19"/>
+                <w:szCs w:val="19"/>
+              </w:rPr>
+              <w:t xml:space="preserve">Partial sanctions relief and SWIFT reconnection are reopening trade and payments, but U.S. licenses still govern many transactions</w:t>
+            </w:r>
+          </w:p>
+          <w:p>
+            <w:pPr>
+              <w:pStyle w:val="ListParagraph"/>
+              <w:numPr>
+                <w:ilvl w:val="0"/>
+                <w:numId w:val="2"/>
+              </w:numPr>
+              <w:spacing w:after="40"/>
+            </w:pPr>
+            <w:r>
+              <w:rPr>
+                <w:rFonts w:ascii="Calibri" w:cs="Calibri" w:eastAsia="Calibri" w:hAnsi="Calibri"/>
+                <w:sz w:val="19"/>
+                <w:szCs w:val="19"/>
+              </w:rPr>
+              <w:t xml:space="preserve">VACC aims to make the diaspora a "strategic bridge for the country's reconstruction" with a "democratic, transparent" vision</w:t>
+            </w:r>
+          </w:p>
+        </w:tc>
+      </w:tr>
+      <w:tr>
+        <w:trPr>
+          <w:cantSplit/>
+        </w:trPr>
+        <w:tc>
+          <w:tcPr>
+            <w:tcW w:type="dxa" w:w="2300"/>
+            <w:tcBorders>
+              <w:top w:val="single" w:color="BFBFBF" w:sz="4"/>
+              <w:left w:val="single" w:color="BFBFBF" w:sz="4"/>
+              <w:bottom w:val="single" w:color="BFBFBF" w:sz="4"/>
+              <w:right w:val="single" w:color="BFBFBF" w:sz="4"/>
+            </w:tcBorders>
+            <w:shd w:fill="DEEAF6" w:color="auto" w:val="clear"/>
+            <w:tcMar>
+              <w:top w:type="dxa" w:w="80"/>
+              <w:left w:type="dxa" w:w="120"/>
+              <w:bottom w:type="dxa" w:w="80"/>
+              <w:right w:type="dxa" w:w="120"/>
+            </w:tcMar>
+          </w:tcPr>
+          <w:p>
+            <w:r>
+              <w:rPr>
+                <w:rFonts w:ascii="Calibri" w:cs="Calibri" w:eastAsia="Calibri" w:hAnsi="Calibri"/>
+                <w:b/>
+                <w:bCs/>
+                <w:color w:val="1F3864"/>
+                <w:sz w:val="19"/>
+                <w:szCs w:val="19"/>
+              </w:rPr>
+              <w:t xml:space="preserve">Proposed engagement</w:t>
+            </w:r>
+          </w:p>
+        </w:tc>
+        <w:tc>
+          <w:tcPr>
+            <w:tcW w:type="dxa" w:w="7060"/>
+            <w:tcBorders>
+              <w:top w:val="single" w:color="BFBFBF" w:sz="4"/>
+              <w:left w:val="single" w:color="BFBFBF" w:sz="4"/>
+              <w:bottom w:val="single" w:color="BFBFBF" w:sz="4"/>
+              <w:right w:val="single" w:color="BFBFBF" w:sz="4"/>
+            </w:tcBorders>
+            <w:tcMar>
+              <w:top w:type="dxa" w:w="80"/>
+              <w:left w:type="dxa" w:w="120"/>
+              <w:bottom w:type="dxa" w:w="80"/>
+              <w:right w:type="dxa" w:w="120"/>
+            </w:tcMar>
+          </w:tcPr>
+          <w:p>
+            <w:pPr>
+              <w:spacing w:after="60"/>
+            </w:pPr>
+            <w:r>
+              <w:rPr>
+                <w:rFonts w:ascii="Calibri" w:cs="Calibri" w:eastAsia="Calibri" w:hAnsi="Calibri"/>
+                <w:sz w:val="19"/>
+                <w:szCs w:val="19"/>
+              </w:rPr>
+              <w:t xml:space="preserve">Miami–Caracas dialogue linking VACC, Fedecámaras and CEDICE with U.S. companies on legal guarantees and investor protection; recommendations on transparent asset classification and privatization; briefing on U.S. licensing and compliance (OFAC) for diaspora and U.S. firms; a map of diaspora skills and capital by sector (energy, logistics, agriculture, manufacturing).</w:t>
+            </w:r>
+          </w:p>
+        </w:tc>
+      </w:tr>
+      <w:tr>
+        <w:trPr>
+          <w:cantSplit/>
+        </w:trPr>
+        <w:tc>
+          <w:tcPr>
+            <w:tcW w:type="dxa" w:w="2300"/>
+            <w:tcBorders>
+              <w:top w:val="single" w:color="BFBFBF" w:sz="4"/>
+              <w:left w:val="single" w:color="BFBFBF" w:sz="4"/>
+              <w:bottom w:val="single" w:color="BFBFBF" w:sz="4"/>
+              <w:right w:val="single" w:color="BFBFBF" w:sz="4"/>
+            </w:tcBorders>
+            <w:shd w:fill="DEEAF6" w:color="auto" w:val="clear"/>
+            <w:tcMar>
+              <w:top w:type="dxa" w:w="80"/>
+              <w:left w:type="dxa" w:w="120"/>
+              <w:bottom w:type="dxa" w:w="80"/>
+              <w:right w:type="dxa" w:w="120"/>
+            </w:tcMar>
+          </w:tcPr>
+          <w:p>
+            <w:r>
+              <w:rPr>
+                <w:rFonts w:ascii="Calibri" w:cs="Calibri" w:eastAsia="Calibri" w:hAnsi="Calibri"/>
+                <w:b/>
+                <w:bCs/>
+                <w:color w:val="1F3864"/>
+                <w:sz w:val="19"/>
+                <w:szCs w:val="19"/>
+              </w:rPr>
+              <w:t xml:space="preserve">Value to U.S. side</w:t>
+            </w:r>
+          </w:p>
+        </w:tc>
+        <w:tc>
+          <w:tcPr>
+            <w:tcW w:type="dxa" w:w="7060"/>
+            <w:tcBorders>
+              <w:top w:val="single" w:color="BFBFBF" w:sz="4"/>
+              <w:left w:val="single" w:color="BFBFBF" w:sz="4"/>
+              <w:bottom w:val="single" w:color="BFBFBF" w:sz="4"/>
+              <w:right w:val="single" w:color="BFBFBF" w:sz="4"/>
+            </w:tcBorders>
+            <w:tcMar>
+              <w:top w:type="dxa" w:w="80"/>
+              <w:left w:type="dxa" w:w="120"/>
+              <w:bottom w:type="dxa" w:w="80"/>
+              <w:right w:type="dxa" w:w="120"/>
+            </w:tcMar>
+          </w:tcPr>
+          <w:p>
+            <w:pPr>
+              <w:spacing w:after="60"/>
+            </w:pPr>
+            <w:r>
+              <w:rPr>
+                <w:rFonts w:ascii="Calibri" w:cs="Calibri" w:eastAsia="Calibri" w:hAnsi="Calibri"/>
+                <w:sz w:val="19"/>
+                <w:szCs w:val="19"/>
+              </w:rPr>
+              <w:t xml:space="preserve">Earlier, lower-risk entry into a reopening market; transparent processes that let U.S. firms compete fairly; compliance clarity; demand for U.S. equipment and services in energy, logistics and agriculture.</w:t>
+            </w:r>
+          </w:p>
+        </w:tc>
+      </w:tr>
+      <w:tr>
+        <w:trPr>
+          <w:cantSplit/>
+        </w:trPr>
+        <w:tc>
+          <w:tcPr>
+            <w:tcW w:type="dxa" w:w="2300"/>
+            <w:tcBorders>
+              <w:top w:val="single" w:color="BFBFBF" w:sz="4"/>
+              <w:left w:val="single" w:color="BFBFBF" w:sz="4"/>
+              <w:bottom w:val="single" w:color="BFBFBF" w:sz="4"/>
+              <w:right w:val="single" w:color="BFBFBF" w:sz="4"/>
+            </w:tcBorders>
+            <w:shd w:fill="DEEAF6" w:color="auto" w:val="clear"/>
+            <w:tcMar>
+              <w:top w:type="dxa" w:w="80"/>
+              <w:left w:type="dxa" w:w="120"/>
+              <w:bottom w:type="dxa" w:w="80"/>
+              <w:right w:type="dxa" w:w="120"/>
+            </w:tcMar>
+          </w:tcPr>
+          <w:p>
+            <w:r>
+              <w:rPr>
+                <w:rFonts w:ascii="Calibri" w:cs="Calibri" w:eastAsia="Calibri" w:hAnsi="Calibri"/>
+                <w:b/>
+                <w:bCs/>
+                <w:color w:val="1F3864"/>
+                <w:sz w:val="19"/>
+                <w:szCs w:val="19"/>
+              </w:rPr>
+              <w:t xml:space="preserve">Value to partner</w:t>
+            </w:r>
+          </w:p>
+        </w:tc>
+        <w:tc>
+          <w:tcPr>
+            <w:tcW w:type="dxa" w:w="7060"/>
+            <w:tcBorders>
+              <w:top w:val="single" w:color="BFBFBF" w:sz="4"/>
+              <w:left w:val="single" w:color="BFBFBF" w:sz="4"/>
+              <w:bottom w:val="single" w:color="BFBFBF" w:sz="4"/>
+              <w:right w:val="single" w:color="BFBFBF" w:sz="4"/>
+            </w:tcBorders>
+            <w:tcMar>
+              <w:top w:type="dxa" w:w="80"/>
+              <w:left w:type="dxa" w:w="120"/>
+              <w:bottom w:type="dxa" w:w="80"/>
+              <w:right w:type="dxa" w:w="120"/>
+            </w:tcMar>
+          </w:tcPr>
+          <w:p>
+            <w:pPr>
+              <w:spacing w:after="60"/>
+            </w:pPr>
+            <w:r>
+              <w:rPr>
+                <w:rFonts w:ascii="Calibri" w:cs="Calibri" w:eastAsia="Calibri" w:hAnsi="Calibri"/>
+                <w:sz w:val="19"/>
+                <w:szCs w:val="19"/>
+              </w:rPr>
+              <w:t xml:space="preserve">A direct channel to U.S. investors and the diaspora's capital and skills; evidence-based reform proposals; credibility with regulators and the interim government.</w:t>
+            </w:r>
+          </w:p>
+        </w:tc>
+      </w:tr>
+      <w:tr>
+        <w:trPr>
+          <w:cantSplit/>
+        </w:trPr>
+        <w:tc>
+          <w:tcPr>
+            <w:tcW w:type="dxa" w:w="2300"/>
+            <w:tcBorders>
+              <w:top w:val="single" w:color="BFBFBF" w:sz="4"/>
+              <w:left w:val="single" w:color="BFBFBF" w:sz="4"/>
+              <w:bottom w:val="single" w:color="BFBFBF" w:sz="4"/>
+              <w:right w:val="single" w:color="BFBFBF" w:sz="4"/>
+            </w:tcBorders>
+            <w:shd w:fill="DEEAF6" w:color="auto" w:val="clear"/>
+            <w:tcMar>
+              <w:top w:type="dxa" w:w="80"/>
+              <w:left w:type="dxa" w:w="120"/>
+              <w:bottom w:type="dxa" w:w="80"/>
+              <w:right w:type="dxa" w:w="120"/>
+            </w:tcMar>
+          </w:tcPr>
+          <w:p>
+            <w:r>
+              <w:rPr>
+                <w:rFonts w:ascii="Calibri" w:cs="Calibri" w:eastAsia="Calibri" w:hAnsi="Calibri"/>
+                <w:b/>
+                <w:bCs/>
+                <w:color w:val="1F3864"/>
+                <w:sz w:val="19"/>
+                <w:szCs w:val="19"/>
+              </w:rPr>
+              <w:t xml:space="preserve">Evidence of success</w:t>
+            </w:r>
+          </w:p>
+        </w:tc>
+        <w:tc>
+          <w:tcPr>
+            <w:tcW w:type="dxa" w:w="7060"/>
+            <w:tcBorders>
+              <w:top w:val="single" w:color="BFBFBF" w:sz="4"/>
+              <w:left w:val="single" w:color="BFBFBF" w:sz="4"/>
+              <w:bottom w:val="single" w:color="BFBFBF" w:sz="4"/>
+              <w:right w:val="single" w:color="BFBFBF" w:sz="4"/>
+            </w:tcBorders>
+            <w:tcMar>
+              <w:top w:type="dxa" w:w="80"/>
+              <w:left w:type="dxa" w:w="120"/>
+              <w:bottom w:type="dxa" w:w="80"/>
+              <w:right w:type="dxa" w:w="120"/>
+            </w:tcMar>
+          </w:tcPr>
+          <w:p>
+            <w:pPr>
+              <w:spacing w:after="60"/>
+            </w:pPr>
+            <w:r>
+              <w:rPr>
+                <w:rFonts w:ascii="Calibri" w:cs="Calibri" w:eastAsia="Calibri" w:hAnsi="Calibri"/>
+                <w:sz w:val="19"/>
+                <w:szCs w:val="19"/>
+              </w:rPr>
+              <w:t xml:space="preserve">Dialogue held in Miami or Caracas; joint recommendations on legal guarantees and asset-classification transparency submitted; licensing briefing delivered; at least one investment or partnership follow-up agreed.</w:t>
+            </w:r>
+          </w:p>
+        </w:tc>
+      </w:tr>
+    </w:tbl>
     <w:p>
       <w:pPr>
-        <w:spacing w:after="120"/>
+        <w:spacing w:before="120"/>
       </w:pPr>
-      <w:r>
-        <w:rPr>
-          <w:rFonts w:ascii="Calibri" w:cs="Calibri" w:eastAsia="Calibri" w:hAnsi="Calibri"/>
-          <w:sz w:val="21"/>
-          <w:szCs w:val="21"/>
-        </w:rPr>
-        <w:t xml:space="preserve">A further connection could link the </w:t>
-      </w:r>
       <w:r>
         <w:rPr>
           <w:rFonts w:ascii="Calibri" w:cs="Calibri" w:eastAsia="Calibri" w:hAnsi="Calibri"/>
           <w:b/>
           <w:bCs/>
-          <w:sz w:val="21"/>
-          <w:szCs w:val="21"/>
+          <w:sz w:val="18"/>
+          <w:szCs w:val="18"/>
         </w:rPr>
-        <w:t xml:space="preserve">Venezuelan-American Chamber of Commerce of the United States</w:t>
+        <w:t xml:space="preserve">Note:</w:t>
       </w:r>
       <w:r>
         <w:rPr>
           <w:rFonts w:ascii="Calibri" w:cs="Calibri" w:eastAsia="Calibri" w:hAnsi="Calibri"/>
-          <w:sz w:val="21"/>
-          <w:szCs w:val="21"/>
+          <w:sz w:val="18"/>
+          <w:szCs w:val="18"/>
         </w:rPr>
-        <w:t xml:space="preserve"> (Miami) and </w:t>
+        <w:t xml:space="preserve"> Risks to manage: the transition is described as fragile; rights groups cited more than 400 political prisoners as of February 2026; U.S. licenses and sanctions rules still apply. Engagement should be conditioned on transparency and checked against current OFAC rules.</w:t>
       </w:r>
+    </w:p>
+    <w:p>
       <w:r>
-        <w:rPr>
-          <w:rFonts w:ascii="Calibri" w:cs="Calibri" w:eastAsia="Calibri" w:hAnsi="Calibri"/>
-          <w:b/>
-          <w:bCs/>
-          <w:sz w:val="21"/>
-          <w:szCs w:val="21"/>
-        </w:rPr>
-        <w:t xml:space="preserve">Fedecámaras</w:t>
-      </w:r>
-      <w:r>
-        <w:rPr>
-          <w:rFonts w:ascii="Calibri" w:cs="Calibri" w:eastAsia="Calibri" w:hAnsi="Calibri"/>
-          <w:sz w:val="21"/>
-          <w:szCs w:val="21"/>
-        </w:rPr>
-        <w:t xml:space="preserve"> with U.S. energy and logistics firms. The likely CIPE partner would be </w:t>
-      </w:r>
-      <w:r>
-        <w:rPr>
-          <w:rFonts w:ascii="Calibri" w:cs="Calibri" w:eastAsia="Calibri" w:hAnsi="Calibri"/>
-          <w:b/>
-          <w:bCs/>
-          <w:sz w:val="21"/>
-          <w:szCs w:val="21"/>
-        </w:rPr>
-        <w:t xml:space="preserve">CEDICE</w:t>
-      </w:r>
-      <w:r>
-        <w:rPr>
-          <w:rFonts w:ascii="Calibri" w:cs="Calibri" w:eastAsia="Calibri" w:hAnsi="Calibri"/>
-          <w:sz w:val="21"/>
-          <w:szCs w:val="21"/>
-        </w:rPr>
-        <w:t xml:space="preserve"> </w:t>
-      </w:r>
-      <w:r>
-        <w:rPr>
-          <w:rFonts w:ascii="Calibri" w:cs="Calibri" w:eastAsia="Calibri" w:hAnsi="Calibri"/>
-          <w:sz w:val="21"/>
-          <w:szCs w:val="21"/>
-          <w:highlight w:val="yellow"/>
-          <w:highlightCs w:val="yellow"/>
-        </w:rPr>
-        <w:t xml:space="preserve">[confirm with CIPE]</w:t>
-      </w:r>
-      <w:r>
-        <w:rPr>
-          <w:rFonts w:ascii="Calibri" w:cs="Calibri" w:eastAsia="Calibri" w:hAnsi="Calibri"/>
-          <w:sz w:val="21"/>
-          <w:szCs w:val="21"/>
-        </w:rPr>
-        <w:t xml:space="preserve">; it is not included above because its current partnership with CIPE was not confirmed.</w:t>
+        <w:br w:type="page"/>
       </w:r>
     </w:p>
     <w:p>
       <w:pPr>
         <w:pStyle w:val="Heading2"/>
-        <w:spacing w:after="80" w:before="200"/>
+        <w:spacing w:after="80"/>
       </w:pPr>
       <w:r>
         <w:rPr>
@@ -6013,7 +6803,7 @@
         </w:numPr>
         <w:spacing w:after="30"/>
       </w:pPr>
-      <w:hyperlink w:history="1" r:id="rIdutrozi2aiotm1d4-x166t">
+      <w:hyperlink w:history="1" r:id="rIdrdwahimsn7dr_tnyan0pe">
         <w:r>
           <w:rPr>
             <w:rStyle w:val="Hyperlink"/>
@@ -6034,7 +6824,7 @@
         </w:numPr>
         <w:spacing w:after="30"/>
       </w:pPr>
-      <w:hyperlink w:history="1" r:id="rIdkcxxuf1c2k9oxprtsxp8m">
+      <w:hyperlink w:history="1" r:id="rIdozdjvqrkxwwuwshrwo9pd">
         <w:r>
           <w:rPr>
             <w:rStyle w:val="Hyperlink"/>
@@ -6055,7 +6845,7 @@
         </w:numPr>
         <w:spacing w:after="30"/>
       </w:pPr>
-      <w:hyperlink w:history="1" r:id="rIdx1qzdsolhxruilefwyl0p">
+      <w:hyperlink w:history="1" r:id="rIdsk5wsp4mle6fmwjik2la5">
         <w:r>
           <w:rPr>
             <w:rStyle w:val="Hyperlink"/>
@@ -6076,7 +6866,7 @@
         </w:numPr>
         <w:spacing w:after="30"/>
       </w:pPr>
-      <w:hyperlink w:history="1" r:id="rIdipr--eb5mply5ezzq5t2e">
+      <w:hyperlink w:history="1" r:id="rId0iu5yhjz2iivvahb4leap">
         <w:r>
           <w:rPr>
             <w:rStyle w:val="Hyperlink"/>
@@ -6097,7 +6887,7 @@
         </w:numPr>
         <w:spacing w:after="30"/>
       </w:pPr>
-      <w:hyperlink w:history="1" r:id="rIdjbsejpahhfclotgddb5vl">
+      <w:hyperlink w:history="1" r:id="rId3iqderohchhkjtglsmczi">
         <w:r>
           <w:rPr>
             <w:rStyle w:val="Hyperlink"/>
@@ -6118,7 +6908,7 @@
         </w:numPr>
         <w:spacing w:after="30"/>
       </w:pPr>
-      <w:hyperlink w:history="1" r:id="rIdzhzsm5bfowxwuy633g9zn">
+      <w:hyperlink w:history="1" r:id="rIdlgph3smuilk1rv7bkeee3">
         <w:r>
           <w:rPr>
             <w:rStyle w:val="Hyperlink"/>
@@ -6139,7 +6929,7 @@
         </w:numPr>
         <w:spacing w:after="30"/>
       </w:pPr>
-      <w:hyperlink w:history="1" r:id="rIdxxxspzt8xbvn63fdlxbfk">
+      <w:hyperlink w:history="1" r:id="rIdclf3ctbyzfajnp2lmbqc4">
         <w:r>
           <w:rPr>
             <w:rStyle w:val="Hyperlink"/>
@@ -6160,7 +6950,7 @@
         </w:numPr>
         <w:spacing w:after="30"/>
       </w:pPr>
-      <w:hyperlink w:history="1" r:id="rId_pnij8rqf0hsjef9xbtzo">
+      <w:hyperlink w:history="1" r:id="rIdp10dlqro3wkpvw5yjw4ep">
         <w:r>
           <w:rPr>
             <w:rStyle w:val="Hyperlink"/>
@@ -6181,7 +6971,7 @@
         </w:numPr>
         <w:spacing w:after="30"/>
       </w:pPr>
-      <w:hyperlink w:history="1" r:id="rId1derfiabjiv09hoyrjull">
+      <w:hyperlink w:history="1" r:id="rIdjzojb5rwpjkgigle4vr1g">
         <w:r>
           <w:rPr>
             <w:rStyle w:val="Hyperlink"/>
@@ -6202,7 +6992,7 @@
         </w:numPr>
         <w:spacing w:after="30"/>
       </w:pPr>
-      <w:hyperlink w:history="1" r:id="rIdlhnrwbpdndz2xzu--w-co">
+      <w:hyperlink w:history="1" r:id="rId8b626zmcg-ckfeeddjusl">
         <w:r>
           <w:rPr>
             <w:rStyle w:val="Hyperlink"/>
@@ -6223,7 +7013,7 @@
         </w:numPr>
         <w:spacing w:after="30"/>
       </w:pPr>
-      <w:hyperlink w:history="1" r:id="rIdxgbzsvea4twu3hhau0wck">
+      <w:hyperlink w:history="1" r:id="rId1cnr_x3oxhil97dwk3x3w">
         <w:r>
           <w:rPr>
             <w:rStyle w:val="Hyperlink"/>
@@ -6244,7 +7034,7 @@
         </w:numPr>
         <w:spacing w:after="30"/>
       </w:pPr>
-      <w:hyperlink w:history="1" r:id="rIdfobd-mm4k9gdrljai1v0m">
+      <w:hyperlink w:history="1" r:id="rIddz5h9czpfakztpzyeg52s">
         <w:r>
           <w:rPr>
             <w:rStyle w:val="Hyperlink"/>
@@ -6265,7 +7055,7 @@
         </w:numPr>
         <w:spacing w:after="30"/>
       </w:pPr>
-      <w:hyperlink w:history="1" r:id="rIdvwd7ltzf1wtsk6hxcn7zk">
+      <w:hyperlink w:history="1" r:id="rIdbwe2k1im23t3bh9togt_s">
         <w:r>
           <w:rPr>
             <w:rStyle w:val="Hyperlink"/>
@@ -6286,7 +7076,7 @@
         </w:numPr>
         <w:spacing w:after="30"/>
       </w:pPr>
-      <w:hyperlink w:history="1" r:id="rIdcjy6i06ugnlskrshlmvkt">
+      <w:hyperlink w:history="1" r:id="rIdsjg4m3cc3njwxzegmhcx4">
         <w:r>
           <w:rPr>
             <w:rStyle w:val="Hyperlink"/>
@@ -6307,7 +7097,7 @@
         </w:numPr>
         <w:spacing w:after="30"/>
       </w:pPr>
-      <w:hyperlink w:history="1" r:id="rIdrzsbcpggcvszxmntqp_56">
+      <w:hyperlink w:history="1" r:id="rIdbk8tvpjx3_o08qurrrxr_">
         <w:r>
           <w:rPr>
             <w:rStyle w:val="Hyperlink"/>
@@ -6328,7 +7118,7 @@
         </w:numPr>
         <w:spacing w:after="30"/>
       </w:pPr>
-      <w:hyperlink w:history="1" r:id="rIdmkgc5v9_-6pmbklpxyzfn">
+      <w:hyperlink w:history="1" r:id="rIdvbovqegq7shc-qskbkf1q">
         <w:r>
           <w:rPr>
             <w:rStyle w:val="Hyperlink"/>
@@ -6349,7 +7139,7 @@
         </w:numPr>
         <w:spacing w:after="30"/>
       </w:pPr>
-      <w:hyperlink w:history="1" r:id="rIdcfcix_c8r5g2d9ik-y210">
+      <w:hyperlink w:history="1" r:id="rId1jfkuzmjj77ibww4tckll">
         <w:r>
           <w:rPr>
             <w:rStyle w:val="Hyperlink"/>
@@ -6370,7 +7160,7 @@
         </w:numPr>
         <w:spacing w:after="30"/>
       </w:pPr>
-      <w:hyperlink w:history="1" r:id="rIde27vtxrsjtep488ifgfjt">
+      <w:hyperlink w:history="1" r:id="rIdcaxhy3rku76sregciyn8l">
         <w:r>
           <w:rPr>
             <w:rStyle w:val="Hyperlink"/>
@@ -6391,7 +7181,7 @@
         </w:numPr>
         <w:spacing w:after="30"/>
       </w:pPr>
-      <w:hyperlink w:history="1" r:id="rId3jtvjx0plf3jhlcvcz20p">
+      <w:hyperlink w:history="1" r:id="rId6m7zef0hbgtp7cahibjes">
         <w:r>
           <w:rPr>
             <w:rStyle w:val="Hyperlink"/>
@@ -6412,7 +7202,7 @@
         </w:numPr>
         <w:spacing w:after="30"/>
       </w:pPr>
-      <w:hyperlink w:history="1" r:id="rIdrswqw6gjnd_uwqxmynp6u">
+      <w:hyperlink w:history="1" r:id="rIdgkzwc-81cavlhdsp5tn67">
         <w:r>
           <w:rPr>
             <w:rStyle w:val="Hyperlink"/>
@@ -6433,7 +7223,7 @@
         </w:numPr>
         <w:spacing w:after="30"/>
       </w:pPr>
-      <w:hyperlink w:history="1" r:id="rIdogwfefowaczo2a4ofde8k">
+      <w:hyperlink w:history="1" r:id="rIdqh9r9zhowepg3fltzhpkr">
         <w:r>
           <w:rPr>
             <w:rStyle w:val="Hyperlink"/>
@@ -6454,7 +7244,7 @@
         </w:numPr>
         <w:spacing w:after="30"/>
       </w:pPr>
-      <w:hyperlink w:history="1" r:id="rIdd_hiu6zxiwpkzwuk7smge">
+      <w:hyperlink w:history="1" r:id="rIdsyjdtqnhlonofog7jo2en">
         <w:r>
           <w:rPr>
             <w:rStyle w:val="Hyperlink"/>
@@ -6475,7 +7265,7 @@
         </w:numPr>
         <w:spacing w:after="30"/>
       </w:pPr>
-      <w:hyperlink w:history="1" r:id="rIdg98ppmymhixk_tu6mijze">
+      <w:hyperlink w:history="1" r:id="rIdjy8g1rhekqsgfac9nkxz9">
         <w:r>
           <w:rPr>
             <w:rStyle w:val="Hyperlink"/>
@@ -6496,7 +7286,7 @@
         </w:numPr>
         <w:spacing w:after="30"/>
       </w:pPr>
-      <w:hyperlink w:history="1" r:id="rIdi0uoqumr-9ahtesh3finz">
+      <w:hyperlink w:history="1" r:id="rIdjvifgb3h9xiwbye5b9b6h">
         <w:r>
           <w:rPr>
             <w:rStyle w:val="Hyperlink"/>
@@ -6517,7 +7307,7 @@
         </w:numPr>
         <w:spacing w:after="30"/>
       </w:pPr>
-      <w:hyperlink w:history="1" r:id="rId2xtnczqthn37ixxidk_4t">
+      <w:hyperlink w:history="1" r:id="rIdnqa68uqavsjweawxflb9s">
         <w:r>
           <w:rPr>
             <w:rStyle w:val="Hyperlink"/>
@@ -6538,7 +7328,7 @@
         </w:numPr>
         <w:spacing w:after="30"/>
       </w:pPr>
-      <w:hyperlink w:history="1" r:id="rIdgf-qw57mkwde3yo8psjau">
+      <w:hyperlink w:history="1" r:id="rIdxtgkoai8nes_eykjiu01v">
         <w:r>
           <w:rPr>
             <w:rStyle w:val="Hyperlink"/>
@@ -6559,7 +7349,7 @@
         </w:numPr>
         <w:spacing w:after="30"/>
       </w:pPr>
-      <w:hyperlink w:history="1" r:id="rIdcrkwgyn7jhf2ali2kxqye">
+      <w:hyperlink w:history="1" r:id="rIdepkrb9fc0u1tmrev3sfj4">
         <w:r>
           <w:rPr>
             <w:rStyle w:val="Hyperlink"/>
@@ -6580,7 +7370,7 @@
         </w:numPr>
         <w:spacing w:after="30"/>
       </w:pPr>
-      <w:hyperlink w:history="1" r:id="rIdixbyvl9t6x8tplls2eanc">
+      <w:hyperlink w:history="1" r:id="rIdsnrtp-klxptragb9urnlp">
         <w:r>
           <w:rPr>
             <w:rStyle w:val="Hyperlink"/>
@@ -6601,7 +7391,7 @@
         </w:numPr>
         <w:spacing w:after="30"/>
       </w:pPr>
-      <w:hyperlink w:history="1" r:id="rIdcc9fevik6eihlcbwh3p91">
+      <w:hyperlink w:history="1" r:id="rId7vm_iqgggw51_onlgvxar">
         <w:r>
           <w:rPr>
             <w:rStyle w:val="Hyperlink"/>
@@ -6622,7 +7412,7 @@
         </w:numPr>
         <w:spacing w:after="30"/>
       </w:pPr>
-      <w:hyperlink w:history="1" r:id="rIdtmwhfwxgor1rarrlsk2wf">
+      <w:hyperlink w:history="1" r:id="rIdxwa63znpytr65dvmxtnt-">
         <w:r>
           <w:rPr>
             <w:rStyle w:val="Hyperlink"/>
@@ -6631,6 +7421,153 @@
             <w:szCs w:val="18"/>
           </w:rPr>
           <w:t xml:space="preserve">DFC – Critical minerals investments</w:t>
+        </w:r>
+      </w:hyperlink>
+    </w:p>
+    <w:p>
+      <w:pPr>
+        <w:pStyle w:val="ListParagraph"/>
+        <w:numPr>
+          <w:ilvl w:val="0"/>
+          <w:numId w:val="2"/>
+        </w:numPr>
+        <w:spacing w:after="30"/>
+      </w:pPr>
+      <w:hyperlink w:history="1" r:id="rIdciyy9__i-l1dx7jbpd5_e">
+        <w:r>
+          <w:rPr>
+            <w:rStyle w:val="Hyperlink"/>
+            <w:rFonts w:ascii="Calibri" w:cs="Calibri" w:eastAsia="Calibri" w:hAnsi="Calibri"/>
+            <w:sz w:val="18"/>
+            <w:szCs w:val="18"/>
+          </w:rPr>
+          <w:t xml:space="preserve">Venezuelan American Chamber of Commerce – new board and goals (2026)</w:t>
+        </w:r>
+      </w:hyperlink>
+    </w:p>
+    <w:p>
+      <w:pPr>
+        <w:pStyle w:val="ListParagraph"/>
+        <w:numPr>
+          <w:ilvl w:val="0"/>
+          <w:numId w:val="2"/>
+        </w:numPr>
+        <w:spacing w:after="30"/>
+      </w:pPr>
+      <w:hyperlink w:history="1" r:id="rIdbnivzghcwftjxihgql00l">
+        <w:r>
+          <w:rPr>
+            <w:rStyle w:val="Hyperlink"/>
+            <w:rFonts w:ascii="Calibri" w:cs="Calibri" w:eastAsia="Calibri" w:hAnsi="Calibri"/>
+            <w:sz w:val="18"/>
+            <w:szCs w:val="18"/>
+          </w:rPr>
+          <w:t xml:space="preserve">NTN24 – Fedecámaras seeks alliance with diaspora entrepreneurs</w:t>
+        </w:r>
+      </w:hyperlink>
+    </w:p>
+    <w:p>
+      <w:pPr>
+        <w:pStyle w:val="ListParagraph"/>
+        <w:numPr>
+          <w:ilvl w:val="0"/>
+          <w:numId w:val="2"/>
+        </w:numPr>
+        <w:spacing w:after="30"/>
+      </w:pPr>
+      <w:hyperlink w:history="1" r:id="rIdzehkv0rfbnu3ed7dkq47s">
+        <w:r>
+          <w:rPr>
+            <w:rStyle w:val="Hyperlink"/>
+            <w:rFonts w:ascii="Calibri" w:cs="Calibri" w:eastAsia="Calibri" w:hAnsi="Calibri"/>
+            <w:sz w:val="18"/>
+            <w:szCs w:val="18"/>
+          </w:rPr>
+          <w:t xml:space="preserve">Fedecámaras – Carta de Valencia (Dec 2025)</w:t>
+        </w:r>
+      </w:hyperlink>
+    </w:p>
+    <w:p>
+      <w:pPr>
+        <w:pStyle w:val="ListParagraph"/>
+        <w:numPr>
+          <w:ilvl w:val="0"/>
+          <w:numId w:val="2"/>
+        </w:numPr>
+        <w:spacing w:after="30"/>
+      </w:pPr>
+      <w:hyperlink w:history="1" r:id="rId6d6anocpklhzeqibsfqok">
+        <w:r>
+          <w:rPr>
+            <w:rStyle w:val="Hyperlink"/>
+            <w:rFonts w:ascii="Calibri" w:cs="Calibri" w:eastAsia="Calibri" w:hAnsi="Calibri"/>
+            <w:sz w:val="18"/>
+            <w:szCs w:val="18"/>
+          </w:rPr>
+          <w:t xml:space="preserve">El Diario – Conindustria Q1 2026 manufacturing growth</w:t>
+        </w:r>
+      </w:hyperlink>
+    </w:p>
+    <w:p>
+      <w:pPr>
+        <w:pStyle w:val="ListParagraph"/>
+        <w:numPr>
+          <w:ilvl w:val="0"/>
+          <w:numId w:val="2"/>
+        </w:numPr>
+        <w:spacing w:after="30"/>
+      </w:pPr>
+      <w:hyperlink w:history="1" r:id="rIdx_7h19wnhfl4kcefg1jt-">
+        <w:r>
+          <w:rPr>
+            <w:rStyle w:val="Hyperlink"/>
+            <w:rFonts w:ascii="Calibri" w:cs="Calibri" w:eastAsia="Calibri" w:hAnsi="Calibri"/>
+            <w:sz w:val="18"/>
+            <w:szCs w:val="18"/>
+          </w:rPr>
+          <w:t xml:space="preserve">Winston &amp; Strawn – Venezuela in transition: the evolving investment landscape</w:t>
+        </w:r>
+      </w:hyperlink>
+    </w:p>
+    <w:p>
+      <w:pPr>
+        <w:pStyle w:val="ListParagraph"/>
+        <w:numPr>
+          <w:ilvl w:val="0"/>
+          <w:numId w:val="2"/>
+        </w:numPr>
+        <w:spacing w:after="30"/>
+      </w:pPr>
+      <w:hyperlink w:history="1" r:id="rId4v0tsjmhvgp6ewwyrxcmo">
+        <w:r>
+          <w:rPr>
+            <w:rStyle w:val="Hyperlink"/>
+            <w:rFonts w:ascii="Calibri" w:cs="Calibri" w:eastAsia="Calibri" w:hAnsi="Calibri"/>
+            <w:sz w:val="18"/>
+            <w:szCs w:val="18"/>
+          </w:rPr>
+          <w:t xml:space="preserve">S-RM – Venezuela in a post-Maduro world (Apr 2026)</w:t>
+        </w:r>
+      </w:hyperlink>
+    </w:p>
+    <w:p>
+      <w:pPr>
+        <w:pStyle w:val="ListParagraph"/>
+        <w:numPr>
+          <w:ilvl w:val="0"/>
+          <w:numId w:val="2"/>
+        </w:numPr>
+        <w:spacing w:after="30"/>
+      </w:pPr>
+      <w:hyperlink w:history="1" r:id="rIdzngimmd2b71noz3hfsz1f">
+        <w:r>
+          <w:rPr>
+            <w:rStyle w:val="Hyperlink"/>
+            <w:rFonts w:ascii="Calibri" w:cs="Calibri" w:eastAsia="Calibri" w:hAnsi="Calibri"/>
+            <w:sz w:val="18"/>
+            <w:szCs w:val="18"/>
+          </w:rPr>
+          <w:t xml:space="preserve">World Oil – Venezuela output outlook (Chevron investment plans)</w:t>
         </w:r>
       </w:hyperlink>
     </w:p>

</xml_diff>